<commit_message>
worksheets: rework 26 AI-102 lab worksheets into 22 AI-103 worksheets
Replace the old AI-102 worksheet set with 22 worksheets aligned to the
AI-103T00-A labs (Lab01-22): retitled, re-authored against the official
MicrosoftLearning lab exercises, with updated screenshot points and
reflection questions. Removes Lab08b/08c and Lab23-26; adds Lab08/Lab10.

Co-Authored-By: Claude Opus 4.7 (1M context) <noreply@anthropic.com>
</commit_message>
<xml_diff>
--- a/worksheets/Lab01-Worksheet.docx
+++ b/worksheets/Lab01-Worksheet.docx
@@ -24,7 +24,7 @@
           <w:color w:val="1A3C6E"/>
           <w:sz w:val="32"/>
         </w:rPr>
-        <w:t>Lab 01 — Choose and deploy a language model</w:t>
+        <w:t>Lab 01 — Prepare for an AI development project</w:t>
       </w:r>
     </w:p>
     <w:p>
@@ -117,7 +117,7 @@
     </w:p>
     <w:p>
       <w:r>
-        <w:t>In this lab, you explored the model catalog in Microsoft Foundry portal, compared gpt-4o and Phi-4-reasoning models using the Compare models visual chart and benchmarks, created a Foundry project with a gpt-4o deployment, tested it in the chat playground with a river-crossing logic puzzle, then deployed and tested a Phi-4-reasoning model for comparison.</w:t>
+        <w:t>In this lab, you created a Microsoft Foundry project, deployed a gpt-4.1 model, and explored project endpoints and authentication keys needed for AI development. You also installed and configured the Foundry Toolkit extension for Visual Studio Code and interacted with the deployed model through the built-in model playground.</w:t>
       </w:r>
     </w:p>
     <w:p/>
@@ -145,12 +145,12 @@
           <w:b/>
           <w:sz w:val="22"/>
         </w:rPr>
-        <w:t>Screenshot 1 — Model Comparison Chart</w:t>
+        <w:t>Screenshot 1 — Foundry Project Home</w:t>
       </w:r>
     </w:p>
     <w:p>
       <w:r>
-        <w:t>After selecting gpt-4o and Phi-4-reasoning in the Compare models view, capture the visual chart showing Quality Index vs. Cost for both models.</w:t>
+        <w:t>After your Microsoft Foundry project is created and the project home page loads, capture a screenshot showing the project name, the Azure OpenAI endpoint, and the project endpoint listed on the home page.</w:t>
       </w:r>
     </w:p>
     <w:tbl>
@@ -193,12 +193,12 @@
           <w:b/>
           <w:sz w:val="22"/>
         </w:rPr>
-        <w:t>Screenshot 2 — Model Benchmarks</w:t>
+        <w:t>Screenshot 2 — Model Playground Response</w:t>
       </w:r>
     </w:p>
     <w:p>
       <w:r>
-        <w:t>On the gpt-4o model page, view the Benchmarks tab. Capture the benchmark comparison showing how gpt-4o compares with other models on standard performance metrics.</w:t>
+        <w:t>In the model playground, after you enter the system prompt and submit a question about LLM considerations, capture a screenshot showing the gpt-4.1 model's response in the chat window.</w:t>
       </w:r>
     </w:p>
     <w:tbl>
@@ -241,12 +241,12 @@
           <w:b/>
           <w:sz w:val="22"/>
         </w:rPr>
-        <w:t>Screenshot 3 — Chat Playground Response</w:t>
+        <w:t>Screenshot 3 — VS Code Foundry Toolkit</w:t>
       </w:r>
     </w:p>
     <w:p>
       <w:r>
-        <w:t>After deploying both gpt-4o and Phi-4-reasoning, enter the fox/chicken/grain river-crossing puzzle in the chat playground. Capture the model's response showing the step-by-step solution.</w:t>
+        <w:t>In Visual Studio Code with the Foundry Toolkit extension installed, capture a screenshot of the AI Toolkit panel showing your Microsoft Foundry project selected as default and the deployed gpt-4.1 model visible under the Models list.</w:t>
       </w:r>
     </w:p>
     <w:tbl>
@@ -299,7 +299,7 @@
           <w:b/>
           <w:sz w:val="22"/>
         </w:rPr>
-        <w:t>1. When you compared gpt-4o and Phi-4-reasoning on the visual comparison chart, how did they differ in Quality Index vs. Cost? Which model appeared to offer better value?</w:t>
+        <w:t>1. What is the difference between the Project endpoint and the Azure OpenAI endpoint shown on the Foundry project home page, and when would a developer choose one over the other?</w:t>
       </w:r>
     </w:p>
     <w:p>
@@ -320,7 +320,7 @@
           <w:b/>
           <w:sz w:val="22"/>
         </w:rPr>
-        <w:t>2. In the chat playground, how did gpt-4o and Phi-4-reasoning differ in their responses to the river-crossing logic puzzle? Were there differences in accuracy, reasoning depth, or response length?</w:t>
+        <w:t>2. Why does Microsoft Foundry separate authentication into API keys and Azure credential-based token providers, and what are the security implications of each approach?</w:t>
       </w:r>
     </w:p>
     <w:p>
@@ -341,7 +341,7 @@
           <w:b/>
           <w:sz w:val="22"/>
         </w:rPr>
-        <w:t>3. Based on the benchmarks and playground testing, in what scenario would you choose Phi-4-reasoning over gpt-4o despite potential trade-offs? Justify using specific benchmark data you observed.</w:t>
+        <w:t>3. How does deploying a model inside a Microsoft Foundry project differ from accessing a model through a standalone Azure OpenAI resource, in terms of resource management and governance?</w:t>
       </w:r>
     </w:p>
     <w:p>

</xml_diff>